<commit_message>
update sup figures and edit ms
</commit_message>
<xml_diff>
--- a/Sup Figures/Supplementary Figure Legend 0508.docx
+++ b/Sup Figures/Supplementary Figure Legend 0508.docx
@@ -197,15 +197,7 @@
           <w:b/>
           <w:bCs/>
         </w:rPr>
-        <w:t>S</w:t>
-      </w:r>
-      <w:r>
-        <w:rPr>
-          <w:rFonts w:ascii="Times New Roman" w:hAnsi="Times New Roman" w:cs="Times New Roman" w:hint="eastAsia"/>
-          <w:b/>
-          <w:bCs/>
-        </w:rPr>
-        <w:t>2</w:t>
+        <w:t>S2</w:t>
       </w:r>
       <w:r>
         <w:rPr>
@@ -376,18 +368,30 @@
         </w:rPr>
         <w:t>, * p &lt; 0.05, ** p &lt; 0.01, *** p &lt; 0.001</w:t>
       </w:r>
+      <w:r>
+        <w:rPr>
+          <w:rFonts w:ascii="Times New Roman" w:hAnsi="Times New Roman" w:cs="Times New Roman"/>
+        </w:rPr>
+        <w:t>)</w:t>
+      </w:r>
+      <w:r>
+        <w:rPr>
+          <w:rFonts w:ascii="Times New Roman" w:hAnsi="Times New Roman" w:cs="Times New Roman"/>
+        </w:rPr>
+        <w:t>.</w:t>
+      </w:r>
+      <w:r>
+        <w:rPr>
+          <w:rFonts w:ascii="Times New Roman" w:hAnsi="Times New Roman" w:cs="Times New Roman" w:hint="eastAsia"/>
+        </w:rPr>
+        <w:t xml:space="preserve"> </w:t>
+      </w:r>
       <w:proofErr w:type="gramStart"/>
       <w:r>
         <w:rPr>
           <w:rFonts w:ascii="Times New Roman" w:hAnsi="Times New Roman" w:cs="Times New Roman"/>
         </w:rPr>
-        <w:t>)</w:t>
-      </w:r>
-      <w:r>
-        <w:rPr>
-          <w:rFonts w:ascii="Times New Roman" w:hAnsi="Times New Roman" w:cs="Times New Roman"/>
-        </w:rPr>
-        <w:t>.Color</w:t>
+        <w:t>Color</w:t>
       </w:r>
       <w:proofErr w:type="gramEnd"/>
       <w:r>
@@ -695,15 +699,7 @@
           <w:b/>
           <w:bCs/>
         </w:rPr>
-        <w:t>S</w:t>
-      </w:r>
-      <w:r>
-        <w:rPr>
-          <w:rFonts w:ascii="Times New Roman" w:hAnsi="Times New Roman" w:cs="Times New Roman" w:hint="eastAsia"/>
-          <w:b/>
-          <w:bCs/>
-        </w:rPr>
-        <w:t>3</w:t>
+        <w:t>S3</w:t>
       </w:r>
       <w:r>
         <w:rPr>
@@ -1068,6 +1064,11 @@
       </w:r>
     </w:p>
     <w:p>
+      <w:pPr>
+        <w:rPr>
+          <w:rFonts w:ascii="Times New Roman" w:hAnsi="Times New Roman" w:cs="Times New Roman"/>
+        </w:rPr>
+      </w:pPr>
       <w:r>
         <w:rPr>
           <w:rFonts w:ascii="Times New Roman" w:hAnsi="Times New Roman" w:cs="Times New Roman"/>
@@ -1207,6 +1208,187 @@
           <w:rFonts w:ascii="Times New Roman" w:hAnsi="Times New Roman" w:cs="Times New Roman"/>
         </w:rPr>
         <w:t xml:space="preserve"> and ID_L was shown in the plot</w:t>
+      </w:r>
+    </w:p>
+    <w:p>
+      <w:pPr>
+        <w:rPr>
+          <w:rFonts w:ascii="Times New Roman" w:hAnsi="Times New Roman" w:cs="Times New Roman"/>
+        </w:rPr>
+      </w:pPr>
+      <w:r>
+        <w:rPr>
+          <w:rFonts w:ascii="Times New Roman" w:hAnsi="Times New Roman" w:cs="Times New Roman"/>
+          <w:b/>
+          <w:bCs/>
+        </w:rPr>
+        <w:t>Figure S5. Mutational spectra of RNase H2-deficient murine tumors and RPE1 cell clones.</w:t>
+      </w:r>
+      <w:r>
+        <w:rPr>
+          <w:rFonts w:ascii="Times New Roman" w:hAnsi="Times New Roman" w:cs="Times New Roman"/>
+        </w:rPr>
+        <w:t xml:space="preserve"> </w:t>
+      </w:r>
+    </w:p>
+    <w:p>
+      <w:pPr>
+        <w:rPr>
+          <w:rFonts w:ascii="Times New Roman" w:hAnsi="Times New Roman" w:cs="Times New Roman"/>
+        </w:rPr>
+      </w:pPr>
+      <w:r>
+        <w:rPr>
+          <w:rFonts w:ascii="Times New Roman" w:hAnsi="Times New Roman" w:cs="Times New Roman"/>
+        </w:rPr>
+        <w:t xml:space="preserve">From top to bottom, spectra are displayed in 83-type, 89-type, and partial 476-type representations (specifically highlighting </w:t>
+      </w:r>
+      <w:r>
+        <w:rPr>
+          <w:rFonts w:ascii="Times New Roman" w:hAnsi="Times New Roman" w:cs="Times New Roman" w:hint="eastAsia"/>
+        </w:rPr>
+        <w:t>≥</w:t>
+      </w:r>
+      <w:r>
+        <w:rPr>
+          <w:rFonts w:ascii="Times New Roman" w:hAnsi="Times New Roman" w:cs="Times New Roman"/>
+        </w:rPr>
+        <w:t xml:space="preserve">2bp deletions, </w:t>
+      </w:r>
+      <w:r>
+        <w:rPr>
+          <w:rFonts w:ascii="Times New Roman" w:hAnsi="Times New Roman" w:cs="Times New Roman" w:hint="eastAsia"/>
+        </w:rPr>
+        <w:t>≥</w:t>
+      </w:r>
+      <w:r>
+        <w:rPr>
+          <w:rFonts w:ascii="Times New Roman" w:hAnsi="Times New Roman" w:cs="Times New Roman"/>
+        </w:rPr>
+        <w:t>2bp insertions, and deletions with microhomology). Predominant peaks for ID_F/</w:t>
+      </w:r>
+      <w:proofErr w:type="spellStart"/>
+      <w:r>
+        <w:rPr>
+          <w:rFonts w:ascii="Times New Roman" w:hAnsi="Times New Roman" w:cs="Times New Roman"/>
+        </w:rPr>
+        <w:t>InsDel_F</w:t>
+      </w:r>
+      <w:proofErr w:type="spellEnd"/>
+      <w:r>
+        <w:rPr>
+          <w:rFonts w:ascii="Times New Roman" w:hAnsi="Times New Roman" w:cs="Times New Roman"/>
+        </w:rPr>
+        <w:t xml:space="preserve"> are evident in both RNase H2-deficient tumors and RPE1 clones, characterized by: Del:2</w:t>
+      </w:r>
+      <w:proofErr w:type="gramStart"/>
+      <w:r>
+        <w:rPr>
+          <w:rFonts w:ascii="Times New Roman" w:hAnsi="Times New Roman" w:cs="Times New Roman"/>
+        </w:rPr>
+        <w:t>bp:Repeats</w:t>
+      </w:r>
+      <w:proofErr w:type="gramEnd"/>
+      <w:r>
+        <w:rPr>
+          <w:rFonts w:ascii="Times New Roman" w:hAnsi="Times New Roman" w:cs="Times New Roman"/>
+        </w:rPr>
+        <w:t>:2 and Del:2bp:MH:1 (83-type); L(2,8</w:t>
+      </w:r>
+      <w:proofErr w:type="gramStart"/>
+      <w:r>
+        <w:rPr>
+          <w:rFonts w:ascii="Times New Roman" w:hAnsi="Times New Roman" w:cs="Times New Roman"/>
+        </w:rPr>
+        <w:t>):U</w:t>
+      </w:r>
+      <w:proofErr w:type="gramEnd"/>
+      <w:r>
+        <w:rPr>
+          <w:rFonts w:ascii="Times New Roman" w:hAnsi="Times New Roman" w:cs="Times New Roman"/>
+        </w:rPr>
+        <w:t>(1,2</w:t>
+      </w:r>
+      <w:proofErr w:type="gramStart"/>
+      <w:r>
+        <w:rPr>
+          <w:rFonts w:ascii="Times New Roman" w:hAnsi="Times New Roman" w:cs="Times New Roman"/>
+        </w:rPr>
+        <w:t>):R</w:t>
+      </w:r>
+      <w:proofErr w:type="gramEnd"/>
+      <w:r>
+        <w:rPr>
+          <w:rFonts w:ascii="Times New Roman" w:hAnsi="Times New Roman" w:cs="Times New Roman"/>
+        </w:rPr>
+        <w:t xml:space="preserve">(2,4) and </w:t>
+      </w:r>
+      <w:proofErr w:type="gramStart"/>
+      <w:r>
+        <w:rPr>
+          <w:rFonts w:ascii="Times New Roman" w:hAnsi="Times New Roman" w:cs="Times New Roman"/>
+        </w:rPr>
+        <w:t>L(</w:t>
+      </w:r>
+      <w:proofErr w:type="gramEnd"/>
+      <w:r>
+        <w:rPr>
+          <w:rFonts w:ascii="Times New Roman" w:hAnsi="Times New Roman" w:cs="Times New Roman"/>
+        </w:rPr>
+        <w:t>2,5):M1 (89-type); and Del</w:t>
+      </w:r>
+      <w:proofErr w:type="gramStart"/>
+      <w:r>
+        <w:rPr>
+          <w:rFonts w:ascii="Times New Roman" w:hAnsi="Times New Roman" w:cs="Times New Roman"/>
+        </w:rPr>
+        <w:t>2:U2</w:t>
+      </w:r>
+      <w:proofErr w:type="gramEnd"/>
+      <w:r>
+        <w:rPr>
+          <w:rFonts w:ascii="Times New Roman" w:hAnsi="Times New Roman" w:cs="Times New Roman"/>
+        </w:rPr>
+        <w:t>:R2 and Del2:M1 (476-type). Notably, these features are nearly absent in wild-type RPE1 control clones.</w:t>
+      </w:r>
+    </w:p>
+    <w:p>
+      <w:pPr>
+        <w:rPr>
+          <w:rFonts w:hint="eastAsia"/>
+        </w:rPr>
+      </w:pPr>
+      <w:r>
+        <w:rPr>
+          <w:rFonts w:ascii="Times New Roman" w:hAnsi="Times New Roman" w:cs="Times New Roman"/>
+          <w:b/>
+          <w:bCs/>
+        </w:rPr>
+        <w:t>Figure S</w:t>
+      </w:r>
+      <w:r>
+        <w:rPr>
+          <w:rFonts w:ascii="Times New Roman" w:hAnsi="Times New Roman" w:cs="Times New Roman" w:hint="eastAsia"/>
+          <w:b/>
+          <w:bCs/>
+        </w:rPr>
+        <w:t>6</w:t>
+      </w:r>
+      <w:r>
+        <w:rPr>
+          <w:rFonts w:ascii="Times New Roman" w:hAnsi="Times New Roman" w:cs="Times New Roman"/>
+          <w:b/>
+          <w:bCs/>
+        </w:rPr>
+        <w:t>.</w:t>
+      </w:r>
+      <w:r>
+        <w:rPr>
+          <w:rFonts w:ascii="Times New Roman" w:hAnsi="Times New Roman" w:cs="Times New Roman" w:hint="eastAsia"/>
+          <w:b/>
+          <w:bCs/>
+        </w:rPr>
+        <w:t xml:space="preserve"> Demographic association of indel signatures with gender and age</w:t>
       </w:r>
     </w:p>
     <w:sectPr>
@@ -1217,6 +1399,56 @@
     </w:sectPr>
   </w:body>
 </w:document>
+</file>
+
+<file path=word/endnotes.xml><?xml version="1.0" encoding="utf-8"?>
+<w:endnotes xmlns:wpc="http://schemas.microsoft.com/office/word/2010/wordprocessingCanvas" xmlns:cx="http://schemas.microsoft.com/office/drawing/2014/chartex" xmlns:cx1="http://schemas.microsoft.com/office/drawing/2015/9/8/chartex" xmlns:cx2="http://schemas.microsoft.com/office/drawing/2015/10/21/chartex" xmlns:cx3="http://schemas.microsoft.com/office/drawing/2016/5/9/chartex" xmlns:cx4="http://schemas.microsoft.com/office/drawing/2016/5/10/chartex" xmlns:cx5="http://schemas.microsoft.com/office/drawing/2016/5/11/chartex" xmlns:cx6="http://schemas.microsoft.com/office/drawing/2016/5/12/chartex" xmlns:cx7="http://schemas.microsoft.com/office/drawing/2016/5/13/chartex" xmlns:cx8="http://schemas.microsoft.com/office/drawing/2016/5/14/chartex" xmlns:mc="http://schemas.openxmlformats.org/markup-compatibility/2006" xmlns:aink="http://schemas.microsoft.com/office/drawing/2016/ink" xmlns:am3d="http://schemas.microsoft.com/office/drawing/2017/model3d" xmlns:o="urn:schemas-microsoft-com:office:office" xmlns:oel="http://schemas.microsoft.com/office/2019/extlst" xmlns:r="http://schemas.openxmlformats.org/officeDocument/2006/relationships" xmlns:m="http://schemas.openxmlformats.org/officeDocument/2006/math" xmlns:v="urn:schemas-microsoft-com:vml" xmlns:wp14="http://schemas.microsoft.com/office/word/2010/wordprocessingDrawing" xmlns:wp="http://schemas.openxmlformats.org/drawingml/2006/wordprocessingDrawing" xmlns:w10="urn:schemas-microsoft-com:office:word" xmlns:w="http://schemas.openxmlformats.org/wordprocessingml/2006/main" xmlns:w14="http://schemas.microsoft.com/office/word/2010/wordml" xmlns:w15="http://schemas.microsoft.com/office/word/2012/wordml" xmlns:w16cex="http://schemas.microsoft.com/office/word/2018/wordml/cex" xmlns:w16cid="http://schemas.microsoft.com/office/word/2016/wordml/cid" xmlns:w16="http://schemas.microsoft.com/office/word/2018/wordml" xmlns:w16du="http://schemas.microsoft.com/office/word/2023/wordml/word16du" xmlns:w16sdtdh="http://schemas.microsoft.com/office/word/2020/wordml/sdtdatahash" xmlns:w16sdtfl="http://schemas.microsoft.com/office/word/2024/wordml/sdtformatlock" xmlns:w16se="http://schemas.microsoft.com/office/word/2015/wordml/symex" xmlns:wpg="http://schemas.microsoft.com/office/word/2010/wordprocessingGroup" xmlns:wpi="http://schemas.microsoft.com/office/word/2010/wordprocessingInk" xmlns:wne="http://schemas.microsoft.com/office/word/2006/wordml" xmlns:wps="http://schemas.microsoft.com/office/word/2010/wordprocessingShape" mc:Ignorable="w14 w15 w16se w16cid w16 w16cex w16sdtdh w16sdtfl w16du wp14">
+  <w:endnote w:type="separator" w:id="-1">
+    <w:p>
+      <w:pPr>
+        <w:spacing w:after="0" w:line="240" w:lineRule="auto"/>
+      </w:pPr>
+      <w:r>
+        <w:separator/>
+      </w:r>
+    </w:p>
+  </w:endnote>
+  <w:endnote w:type="continuationSeparator" w:id="0">
+    <w:p>
+      <w:pPr>
+        <w:spacing w:after="0" w:line="240" w:lineRule="auto"/>
+      </w:pPr>
+      <w:r>
+        <w:continuationSeparator/>
+      </w:r>
+    </w:p>
+  </w:endnote>
+</w:endnotes>
+</file>
+
+<file path=word/footnotes.xml><?xml version="1.0" encoding="utf-8"?>
+<w:footnotes xmlns:wpc="http://schemas.microsoft.com/office/word/2010/wordprocessingCanvas" xmlns:cx="http://schemas.microsoft.com/office/drawing/2014/chartex" xmlns:cx1="http://schemas.microsoft.com/office/drawing/2015/9/8/chartex" xmlns:cx2="http://schemas.microsoft.com/office/drawing/2015/10/21/chartex" xmlns:cx3="http://schemas.microsoft.com/office/drawing/2016/5/9/chartex" xmlns:cx4="http://schemas.microsoft.com/office/drawing/2016/5/10/chartex" xmlns:cx5="http://schemas.microsoft.com/office/drawing/2016/5/11/chartex" xmlns:cx6="http://schemas.microsoft.com/office/drawing/2016/5/12/chartex" xmlns:cx7="http://schemas.microsoft.com/office/drawing/2016/5/13/chartex" xmlns:cx8="http://schemas.microsoft.com/office/drawing/2016/5/14/chartex" xmlns:mc="http://schemas.openxmlformats.org/markup-compatibility/2006" xmlns:aink="http://schemas.microsoft.com/office/drawing/2016/ink" xmlns:am3d="http://schemas.microsoft.com/office/drawing/2017/model3d" xmlns:o="urn:schemas-microsoft-com:office:office" xmlns:oel="http://schemas.microsoft.com/office/2019/extlst" xmlns:r="http://schemas.openxmlformats.org/officeDocument/2006/relationships" xmlns:m="http://schemas.openxmlformats.org/officeDocument/2006/math" xmlns:v="urn:schemas-microsoft-com:vml" xmlns:wp14="http://schemas.microsoft.com/office/word/2010/wordprocessingDrawing" xmlns:wp="http://schemas.openxmlformats.org/drawingml/2006/wordprocessingDrawing" xmlns:w10="urn:schemas-microsoft-com:office:word" xmlns:w="http://schemas.openxmlformats.org/wordprocessingml/2006/main" xmlns:w14="http://schemas.microsoft.com/office/word/2010/wordml" xmlns:w15="http://schemas.microsoft.com/office/word/2012/wordml" xmlns:w16cex="http://schemas.microsoft.com/office/word/2018/wordml/cex" xmlns:w16cid="http://schemas.microsoft.com/office/word/2016/wordml/cid" xmlns:w16="http://schemas.microsoft.com/office/word/2018/wordml" xmlns:w16du="http://schemas.microsoft.com/office/word/2023/wordml/word16du" xmlns:w16sdtdh="http://schemas.microsoft.com/office/word/2020/wordml/sdtdatahash" xmlns:w16sdtfl="http://schemas.microsoft.com/office/word/2024/wordml/sdtformatlock" xmlns:w16se="http://schemas.microsoft.com/office/word/2015/wordml/symex" xmlns:wpg="http://schemas.microsoft.com/office/word/2010/wordprocessingGroup" xmlns:wpi="http://schemas.microsoft.com/office/word/2010/wordprocessingInk" xmlns:wne="http://schemas.microsoft.com/office/word/2006/wordml" xmlns:wps="http://schemas.microsoft.com/office/word/2010/wordprocessingShape" mc:Ignorable="w14 w15 w16se w16cid w16 w16cex w16sdtdh w16sdtfl w16du wp14">
+  <w:footnote w:type="separator" w:id="-1">
+    <w:p>
+      <w:pPr>
+        <w:spacing w:after="0" w:line="240" w:lineRule="auto"/>
+      </w:pPr>
+      <w:r>
+        <w:separator/>
+      </w:r>
+    </w:p>
+  </w:footnote>
+  <w:footnote w:type="continuationSeparator" w:id="0">
+    <w:p>
+      <w:pPr>
+        <w:spacing w:after="0" w:line="240" w:lineRule="auto"/>
+      </w:pPr>
+      <w:r>
+        <w:continuationSeparator/>
+      </w:r>
+    </w:p>
+  </w:footnote>
+</w:footnotes>
 </file>
 
 <file path=word/styles.xml><?xml version="1.0" encoding="utf-8"?>
@@ -1826,7 +2058,6 @@
   <w:style w:type="character" w:default="1" w:styleId="DefaultParagraphFont">
     <w:name w:val="Default Paragraph Font"/>
     <w:uiPriority w:val="1"/>
-    <w:semiHidden/>
     <w:unhideWhenUsed/>
   </w:style>
   <w:style w:type="table" w:default="1" w:styleId="TableNormal">
@@ -2141,6 +2372,69 @@
       <w:smallCaps/>
       <w:color w:val="0F4761" w:themeColor="accent1" w:themeShade="BF"/>
       <w:spacing w:val="5"/>
+    </w:rPr>
+  </w:style>
+  <w:style w:type="paragraph" w:styleId="Header">
+    <w:name w:val="header"/>
+    <w:basedOn w:val="Normal"/>
+    <w:link w:val="HeaderChar"/>
+    <w:uiPriority w:val="99"/>
+    <w:unhideWhenUsed/>
+    <w:rsid w:val="00114424"/>
+    <w:pPr>
+      <w:tabs>
+        <w:tab w:val="center" w:pos="4153"/>
+        <w:tab w:val="right" w:pos="8306"/>
+      </w:tabs>
+      <w:snapToGrid w:val="0"/>
+      <w:spacing w:line="240" w:lineRule="auto"/>
+      <w:jc w:val="center"/>
+    </w:pPr>
+    <w:rPr>
+      <w:sz w:val="18"/>
+      <w:szCs w:val="18"/>
+    </w:rPr>
+  </w:style>
+  <w:style w:type="character" w:customStyle="1" w:styleId="HeaderChar">
+    <w:name w:val="Header Char"/>
+    <w:basedOn w:val="DefaultParagraphFont"/>
+    <w:link w:val="Header"/>
+    <w:uiPriority w:val="99"/>
+    <w:rsid w:val="00114424"/>
+    <w:rPr>
+      <w:sz w:val="18"/>
+      <w:szCs w:val="18"/>
+    </w:rPr>
+  </w:style>
+  <w:style w:type="paragraph" w:styleId="Footer">
+    <w:name w:val="footer"/>
+    <w:basedOn w:val="Normal"/>
+    <w:link w:val="FooterChar"/>
+    <w:uiPriority w:val="99"/>
+    <w:unhideWhenUsed/>
+    <w:rsid w:val="00114424"/>
+    <w:pPr>
+      <w:tabs>
+        <w:tab w:val="center" w:pos="4153"/>
+        <w:tab w:val="right" w:pos="8306"/>
+      </w:tabs>
+      <w:snapToGrid w:val="0"/>
+      <w:spacing w:line="240" w:lineRule="auto"/>
+    </w:pPr>
+    <w:rPr>
+      <w:sz w:val="18"/>
+      <w:szCs w:val="18"/>
+    </w:rPr>
+  </w:style>
+  <w:style w:type="character" w:customStyle="1" w:styleId="FooterChar">
+    <w:name w:val="Footer Char"/>
+    <w:basedOn w:val="DefaultParagraphFont"/>
+    <w:link w:val="Footer"/>
+    <w:uiPriority w:val="99"/>
+    <w:rsid w:val="00114424"/>
+    <w:rPr>
+      <w:sz w:val="18"/>
+      <w:szCs w:val="18"/>
     </w:rPr>
   </w:style>
 </w:styles>

</xml_diff>